<commit_message>
docs(standards): tighten two claims on the adoption page
An artifact 'you can hold up' becomes one that 'either exists or does not' --
the test is existence, not presentability. And a promise that the rest is
'not a quarter either' is dropped: the honest version is that most of what
follows upgrades a control you already run, which is a description rather
than an estimate.
</commit_message>
<xml_diff>
--- a/docs/standards/word/ADOPTING-THESE.docx
+++ b/docs/standards/word/ADOPTING-THESE.docx
@@ -54,25 +54,25 @@
         <w:pStyle w:val="BodyText"/>
       </w:pPr>
       <w:r>
-        <w:t xml:space="preserve">Adoption is five steps, and each one ends in an artifact you can hold up: a marked worksheet, a</w:t>
-      </w:r>
-      <w:r>
-        <w:t xml:space="preserve"> </w:t>
-      </w:r>
-      <w:r>
-        <w:t xml:space="preserve">deviations register, a three-item queue, a set of checks with dates against them, and a project</w:t>
-      </w:r>
-      <w:r>
-        <w:t xml:space="preserve"> </w:t>
-      </w:r>
-      <w:r>
-        <w:t xml:space="preserve">instruction file that references all four. Those artifacts are the deliverable. Having read the</w:t>
-      </w:r>
-      <w:r>
-        <w:t xml:space="preserve"> </w:t>
-      </w:r>
-      <w:r>
-        <w:t xml:space="preserve">documents is not.</w:t>
+        <w:t xml:space="preserve">Adoption is five steps, and each one ends in an artifact that either exists or does not: a marked</w:t>
+      </w:r>
+      <w:r>
+        <w:t xml:space="preserve"> </w:t>
+      </w:r>
+      <w:r>
+        <w:t xml:space="preserve">worksheet, a deviations register, a three-item queue, a set of checks with dates against them, and a</w:t>
+      </w:r>
+      <w:r>
+        <w:t xml:space="preserve"> </w:t>
+      </w:r>
+      <w:r>
+        <w:t xml:space="preserve">project instruction file that references all four. Those artifacts are the deliverable. Having read</w:t>
+      </w:r>
+      <w:r>
+        <w:t xml:space="preserve"> </w:t>
+      </w:r>
+      <w:r>
+        <w:t xml:space="preserve">the documents is not.</w:t>
       </w:r>
     </w:p>
     <w:p>
@@ -139,7 +139,7 @@
         </w:pict>
       </w:r>
     </w:p>
-    <w:bookmarkStart w:id="16" w:name="if-you-only-have-an-afternoon"/>
+    <w:bookmarkStart w:id="17" w:name="if-you-only-have-an-afternoon"/>
     <w:p>
       <w:pPr>
         <w:pStyle w:val="Heading2"/>
@@ -556,13 +556,13 @@
         <w:t xml:space="preserve"> </w:t>
       </w:r>
       <w:r>
-        <w:t xml:space="preserve">you. The afternoon is real, and the rest is not a quarter either, because most of what follows is</w:t>
-      </w:r>
-      <w:r>
-        <w:t xml:space="preserve"> </w:t>
-      </w:r>
-      <w:r>
-        <w:t xml:space="preserve">upgrading a control you already run into the shape the rule asks for.</w:t>
+        <w:t xml:space="preserve">you. Most of what follows is upgrading a control you already run into the shape the rule asks for,</w:t>
+      </w:r>
+      <w:r>
+        <w:t xml:space="preserve"> </w:t>
+      </w:r>
+      <w:r>
+        <w:t xml:space="preserve">rather than building one.</w:t>
       </w:r>
     </w:p>
     <w:p>
@@ -592,7 +592,51 @@
         <w:t xml:space="preserve"> </w:t>
       </w:r>
       <w:r>
-        <w:t xml:space="preserve">iteration.</w:t>
+        <w:t xml:space="preserve">iteration. That instruction is this page's own addition, borrowing a habit the assessment method</w:t>
+      </w:r>
+      <w:r>
+        <w:t xml:space="preserve"> </w:t>
+      </w:r>
+      <w:r>
+        <w:t xml:space="preserve">applies to a published standard's text (</w:t>
+      </w:r>
+      <w:hyperlink r:id="rId16">
+        <w:r>
+          <w:rPr>
+            <w:rStyle w:val="Hyperlink"/>
+          </w:rPr>
+          <w:t xml:space="preserve">Security standard assessment</w:t>
+        </w:r>
+      </w:hyperlink>
+      <w:r>
+        <w:t xml:space="preserve">,</w:t>
+      </w:r>
+      <w:r>
+        <w:t xml:space="preserve"> </w:t>
+      </w:r>
+      <w:r>
+        <w:rPr>
+          <w:i/>
+          <w:iCs/>
+        </w:rPr>
+        <w:t xml:space="preserve">"Pin</w:t>
+      </w:r>
+      <w:r>
+        <w:rPr>
+          <w:i/>
+          <w:iCs/>
+        </w:rPr>
+        <w:t xml:space="preserve"> </w:t>
+      </w:r>
+      <w:r>
+        <w:rPr>
+          <w:i/>
+          <w:iCs/>
+        </w:rPr>
+        <w:t xml:space="preserve">the corpus, and stamp the version on every number"</w:t>
+      </w:r>
+      <w:r>
+        <w:t xml:space="preserve">).</w:t>
       </w:r>
     </w:p>
     <w:p>
@@ -602,8 +646,8 @@
         </w:pict>
       </w:r>
     </w:p>
-    <w:bookmarkEnd w:id="16"/>
-    <w:bookmarkStart w:id="19" w:name="Xfb7ef269d869dacdc900f3a6b6ee71aa2357e54"/>
+    <w:bookmarkEnd w:id="17"/>
+    <w:bookmarkStart w:id="20" w:name="Xfb7ef269d869dacdc900f3a6b6ee71aa2357e54"/>
     <w:p>
       <w:pPr>
         <w:pStyle w:val="Heading2"/>
@@ -648,7 +692,7 @@
       <w:r>
         <w:t xml:space="preserve"> </w:t>
       </w:r>
-      <w:hyperlink r:id="rId17">
+      <w:hyperlink r:id="rId18">
         <w:r>
           <w:rPr>
             <w:rStyle w:val="Hyperlink"/>
@@ -820,7 +864,7 @@
       <w:r>
         <w:t xml:space="preserve"> </w:t>
       </w:r>
-      <w:hyperlink r:id="rId18">
+      <w:hyperlink r:id="rId19">
         <w:r>
           <w:rPr>
             <w:rStyle w:val="Hyperlink"/>
@@ -869,8 +913,8 @@
         </w:pict>
       </w:r>
     </w:p>
-    <w:bookmarkEnd w:id="19"/>
-    <w:bookmarkStart w:id="20" w:name="the-five-artifacts"/>
+    <w:bookmarkEnd w:id="20"/>
+    <w:bookmarkStart w:id="21" w:name="the-five-artifacts"/>
     <w:p>
       <w:pPr>
         <w:pStyle w:val="Heading2"/>
@@ -1221,8 +1265,8 @@
         </w:pict>
       </w:r>
     </w:p>
-    <w:bookmarkEnd w:id="20"/>
-    <w:bookmarkStart w:id="22" w:name="step-1-establish-your-baseline"/>
+    <w:bookmarkEnd w:id="21"/>
+    <w:bookmarkStart w:id="24" w:name="step-1-establish-your-baseline"/>
     <w:p>
       <w:pPr>
         <w:pStyle w:val="Heading2"/>
@@ -1305,7 +1349,7 @@
       <w:r>
         <w:t xml:space="preserve"> </w:t>
       </w:r>
-      <w:hyperlink r:id="rId21">
+      <w:hyperlink r:id="rId22">
         <w:r>
           <w:rPr>
             <w:rStyle w:val="Hyperlink"/>
@@ -1406,7 +1450,7 @@
         <w:pStyle w:val="FirstParagraph"/>
       </w:pPr>
       <w:r>
-        <w:t xml:space="preserve">Fill in the starter set. Seven rows, which is what an afternoon covers.</w:t>
+        <w:t xml:space="preserve">Fill in the starter set. Seven rows. The afternoon list above is how the first of them get filled;</w:t>
       </w:r>
       <w:r>
         <w:t xml:space="preserve"> </w:t>
@@ -1416,32 +1460,20 @@
           <w:rPr>
             <w:rStyle w:val="Hyperlink"/>
           </w:rPr>
-          <w:t xml:space="preserve">The</w:t>
-        </w:r>
-        <w:r>
-          <w:rPr>
-            <w:rStyle w:val="Hyperlink"/>
-          </w:rPr>
-          <w:t xml:space="preserve"> </w:t>
-        </w:r>
-        <w:r>
-          <w:rPr>
-            <w:rStyle w:val="Hyperlink"/>
-          </w:rPr>
-          <w:t xml:space="preserve">worksheet</w:t>
+          <w:t xml:space="preserve">the worksheet</w:t>
         </w:r>
       </w:hyperlink>
       <w:r>
         <w:t xml:space="preserve"> </w:t>
       </w:r>
       <w:r>
-        <w:t xml:space="preserve">at the end of this page is the backlog you work through over releases,</w:t>
-      </w:r>
-      <w:r>
-        <w:t xml:space="preserve"> </w:t>
-      </w:r>
-      <w:r>
-        <w:t xml:space="preserve">not a prerequisite for starting.</w:t>
+        <w:t xml:space="preserve">at the end of this page is the backlog you work through over</w:t>
+      </w:r>
+      <w:r>
+        <w:t xml:space="preserve"> </w:t>
+      </w:r>
+      <w:r>
+        <w:t xml:space="preserve">releases, not a prerequisite for starting.</w:t>
       </w:r>
     </w:p>
     <w:tbl>
@@ -1535,7 +1567,7 @@
             <w:pPr>
               <w:pStyle w:val="Compact"/>
             </w:pPr>
-            <w:hyperlink r:id="rId21">
+            <w:hyperlink r:id="rId22">
               <w:r>
                 <w:rPr>
                   <w:rStyle w:val="Hyperlink"/>
@@ -1601,7 +1633,7 @@
             <w:pPr>
               <w:pStyle w:val="Compact"/>
             </w:pPr>
-            <w:hyperlink r:id="rId21">
+            <w:hyperlink r:id="rId22">
               <w:r>
                 <w:rPr>
                   <w:rStyle w:val="Hyperlink"/>
@@ -1667,7 +1699,7 @@
             <w:pPr>
               <w:pStyle w:val="Compact"/>
             </w:pPr>
-            <w:hyperlink r:id="rId21">
+            <w:hyperlink r:id="rId22">
               <w:r>
                 <w:rPr>
                   <w:rStyle w:val="Hyperlink"/>
@@ -1934,7 +1966,7 @@
               <w:pStyle w:val="Compact"/>
             </w:pPr>
             <w:r>
-              <w:t xml:space="preserve">Secret and identifying-content scan before publish</w:t>
+              <w:t xml:space="preserve">Secrets and restricted data kept out of the repository and its full history, backed by a fail-closed commit-time content scan</w:t>
             </w:r>
           </w:p>
         </w:tc>
@@ -1965,6 +1997,20 @@
               </w:rPr>
               <w:t xml:space="preserve">Secrets and repository hygiene</w:t>
             </w:r>
+            <w:r>
+              <w:t xml:space="preserve">;</w:t>
+            </w:r>
+            <w:r>
+              <w:t xml:space="preserve"> </w:t>
+            </w:r>
+            <w:hyperlink r:id="rId23">
+              <w:r>
+                <w:rPr>
+                  <w:rStyle w:val="Hyperlink"/>
+                </w:rPr>
+                <w:t xml:space="preserve">the leak gate</w:t>
+              </w:r>
+            </w:hyperlink>
           </w:p>
         </w:tc>
         <w:tc>
@@ -1998,19 +2044,13 @@
         <w:pStyle w:val="BodyText"/>
       </w:pPr>
       <w:r>
-        <w:t xml:space="preserve">Two of those seven -- tests that verify behavior, and the threat-model half of the security row --</w:t>
-      </w:r>
-      <w:r>
-        <w:t xml:space="preserve"> </w:t>
-      </w:r>
-      <w:r>
-        <w:t xml:space="preserve">are not in the shipped project instruction template, and both carry the verdict. Step 5 returns to</w:t>
-      </w:r>
-      <w:r>
-        <w:t xml:space="preserve"> </w:t>
-      </w:r>
-      <w:r>
-        <w:t xml:space="preserve">that.</w:t>
+        <w:t xml:space="preserve">Two of those seven -- tests that verify behavior, and the security row entire -- are not in the</w:t>
+      </w:r>
+      <w:r>
+        <w:t xml:space="preserve"> </w:t>
+      </w:r>
+      <w:r>
+        <w:t xml:space="preserve">shipped project instruction template, and both carry the verdict. Step 5 returns to that.</w:t>
       </w:r>
     </w:p>
     <w:p>
@@ -2057,7 +2097,7 @@
       <w:r>
         <w:t xml:space="preserve"> </w:t>
       </w:r>
-      <w:hyperlink r:id="rId21">
+      <w:hyperlink r:id="rId22">
         <w:r>
           <w:rPr>
             <w:rStyle w:val="Hyperlink"/>
@@ -2211,8 +2251,8 @@
         </w:pict>
       </w:r>
     </w:p>
-    <w:bookmarkEnd w:id="22"/>
-    <w:bookmarkStart w:id="25" w:name="X2cc1c400f784b23b4021285b1df8f603c3d18b5"/>
+    <w:bookmarkEnd w:id="24"/>
+    <w:bookmarkStart w:id="28" w:name="X2cc1c400f784b23b4021285b1df8f603c3d18b5"/>
     <w:p>
       <w:pPr>
         <w:pStyle w:val="Heading2"/>
@@ -2292,19 +2332,175 @@
         <w:t xml:space="preserve"> </w:t>
       </w:r>
       <w:r>
-        <w:t xml:space="preserve">section splitting what you may change freely from what you may not weaken. Touching</w:t>
-      </w:r>
-      <w:r>
-        <w:t xml:space="preserve"> </w:t>
-      </w:r>
-      <w:r>
-        <w:t xml:space="preserve">the change-freely list is tailoring and owes no record. Striking something from the do-not-weaken</w:t>
-      </w:r>
-      <w:r>
-        <w:t xml:space="preserve"> </w:t>
-      </w:r>
-      <w:r>
-        <w:t xml:space="preserve">list is a deviation and owes all four fields below.</w:t>
+        <w:t xml:space="preserve">section, and the do-not-weaken items live there. Changing something that section</w:t>
+      </w:r>
+      <w:r>
+        <w:t xml:space="preserve"> </w:t>
+      </w:r>
+      <w:r>
+        <w:t xml:space="preserve">invites you to change is tailoring and owes no record. Striking a do-not-weaken item is a deviation</w:t>
+      </w:r>
+      <w:r>
+        <w:t xml:space="preserve"> </w:t>
+      </w:r>
+      <w:r>
+        <w:t xml:space="preserve">and owes all four fields below. Three of the sections carry two literal lists,</w:t>
+      </w:r>
+      <w:r>
+        <w:t xml:space="preserve"> </w:t>
+      </w:r>
+      <w:r>
+        <w:rPr>
+          <w:i/>
+          <w:iCs/>
+        </w:rPr>
+        <w:t xml:space="preserve">"Change freely"</w:t>
+      </w:r>
+      <w:r>
+        <w:t xml:space="preserve"> </w:t>
+      </w:r>
+      <w:r>
+        <w:t xml:space="preserve">and</w:t>
+      </w:r>
+      <w:r>
+        <w:t xml:space="preserve"> </w:t>
+      </w:r>
+      <w:r>
+        <w:rPr>
+          <w:i/>
+          <w:iCs/>
+        </w:rPr>
+        <w:t xml:space="preserve">"Do not weaken"</w:t>
+      </w:r>
+      <w:r>
+        <w:t xml:space="preserve"> </w:t>
+      </w:r>
+      <w:r>
+        <w:t xml:space="preserve">--</w:t>
+      </w:r>
+      <w:r>
+        <w:t xml:space="preserve"> </w:t>
+      </w:r>
+      <w:hyperlink r:id="rId22">
+        <w:r>
+          <w:rPr>
+            <w:rStyle w:val="Hyperlink"/>
+          </w:rPr>
+          <w:t xml:space="preserve">Code quality</w:t>
+        </w:r>
+      </w:hyperlink>
+      <w:r>
+        <w:t xml:space="preserve">,</w:t>
+      </w:r>
+      <w:r>
+        <w:t xml:space="preserve"> </w:t>
+      </w:r>
+      <w:hyperlink r:id="rId13">
+        <w:r>
+          <w:rPr>
+            <w:rStyle w:val="Hyperlink"/>
+          </w:rPr>
+          <w:t xml:space="preserve">Dependency</w:t>
+        </w:r>
+        <w:r>
+          <w:rPr>
+            <w:rStyle w:val="Hyperlink"/>
+          </w:rPr>
+          <w:t xml:space="preserve"> </w:t>
+        </w:r>
+        <w:r>
+          <w:rPr>
+            <w:rStyle w:val="Hyperlink"/>
+          </w:rPr>
+          <w:t xml:space="preserve">integrity</w:t>
+        </w:r>
+      </w:hyperlink>
+      <w:r>
+        <w:t xml:space="preserve"> </w:t>
+      </w:r>
+      <w:r>
+        <w:t xml:space="preserve">and</w:t>
+      </w:r>
+      <w:r>
+        <w:t xml:space="preserve"> </w:t>
+      </w:r>
+      <w:hyperlink r:id="rId12">
+        <w:r>
+          <w:rPr>
+            <w:rStyle w:val="Hyperlink"/>
+          </w:rPr>
+          <w:t xml:space="preserve">Secure development</w:t>
+        </w:r>
+      </w:hyperlink>
+      <w:r>
+        <w:t xml:space="preserve">. The other two</w:t>
+      </w:r>
+      <w:r>
+        <w:t xml:space="preserve"> </w:t>
+      </w:r>
+      <w:r>
+        <w:t xml:space="preserve">do not, and the difference matters:</w:t>
+      </w:r>
+      <w:r>
+        <w:t xml:space="preserve"> </w:t>
+      </w:r>
+      <w:hyperlink r:id="rId14">
+        <w:r>
+          <w:rPr>
+            <w:rStyle w:val="Hyperlink"/>
+          </w:rPr>
+          <w:t xml:space="preserve">AI-assisted development</w:t>
+        </w:r>
+      </w:hyperlink>
+      <w:r>
+        <w:t xml:space="preserve"> </w:t>
+      </w:r>
+      <w:r>
+        <w:t xml:space="preserve">states its first list as</w:t>
+      </w:r>
+      <w:r>
+        <w:t xml:space="preserve"> </w:t>
+      </w:r>
+      <w:r>
+        <w:rPr>
+          <w:i/>
+          <w:iCs/>
+        </w:rPr>
+        <w:t xml:space="preserve">what you must</w:t>
+      </w:r>
+      <w:r>
+        <w:rPr>
+          <w:i/>
+          <w:iCs/>
+        </w:rPr>
+        <w:t xml:space="preserve"> </w:t>
+      </w:r>
+      <w:r>
+        <w:rPr>
+          <w:i/>
+          <w:iCs/>
+        </w:rPr>
+        <w:t xml:space="preserve">change</w:t>
+      </w:r>
+      <w:r>
+        <w:t xml:space="preserve">, so those items are obligations rather than options;</w:t>
+      </w:r>
+      <w:r>
+        <w:t xml:space="preserve"> </w:t>
+      </w:r>
+      <w:hyperlink r:id="rId25">
+        <w:r>
+          <w:rPr>
+            <w:rStyle w:val="Hyperlink"/>
+          </w:rPr>
+          <w:t xml:space="preserve">Human review of code</w:t>
+        </w:r>
+      </w:hyperlink>
+      <w:r>
+        <w:t xml:space="preserve"> </w:t>
+      </w:r>
+      <w:r>
+        <w:t xml:space="preserve">states no split at all, and calls its do-not-weaken item out inline.</w:t>
       </w:r>
     </w:p>
     <w:tbl>
@@ -2662,7 +2858,7 @@
         <w:t xml:space="preserve">.</w:t>
       </w:r>
     </w:p>
-    <w:bookmarkStart w:id="23" w:name="the-worked-example"/>
+    <w:bookmarkStart w:id="26" w:name="the-worked-example"/>
     <w:p>
       <w:pPr>
         <w:pStyle w:val="Heading3"/>
@@ -2918,7 +3114,7 @@
       <w:r>
         <w:t xml:space="preserve"> </w:t>
       </w:r>
-      <w:hyperlink r:id="rId21">
+      <w:hyperlink r:id="rId22">
         <w:r>
           <w:rPr>
             <w:rStyle w:val="Hyperlink"/>
@@ -2955,8 +3151,8 @@
         <w:t xml:space="preserve">that ends the arrangement.</w:t>
       </w:r>
     </w:p>
-    <w:bookmarkEnd w:id="23"/>
-    <w:bookmarkStart w:id="24" w:name="what-tailoring-is-not"/>
+    <w:bookmarkEnd w:id="26"/>
+    <w:bookmarkStart w:id="27" w:name="what-tailoring-is-not"/>
     <w:p>
       <w:pPr>
         <w:pStyle w:val="Heading3"/>
@@ -3086,31 +3282,31 @@
         <w:t xml:space="preserve"> </w:t>
       </w:r>
       <w:r>
-        <w:t xml:space="preserve">practice applies. Five shapes of the same failure are named across the set, and all five produce a</w:t>
-      </w:r>
-      <w:r>
-        <w:t xml:space="preserve"> </w:t>
-      </w:r>
-      <w:r>
-        <w:t xml:space="preserve">document that survives accuracy review while describing a practice that does not exist: redefining</w:t>
-      </w:r>
-      <w:r>
-        <w:t xml:space="preserve"> </w:t>
-      </w:r>
-      <w:r>
-        <w:t xml:space="preserve">the pass bar so "it can be configured" counts; widening a soft grade until it absorbs everything</w:t>
-      </w:r>
-      <w:r>
-        <w:t xml:space="preserve"> </w:t>
-      </w:r>
-      <w:r>
-        <w:t xml:space="preserve">ambiguous; writing scope as exclusions that grow to swallow inconvenient cases; transferring an</w:t>
-      </w:r>
-      <w:r>
-        <w:t xml:space="preserve"> </w:t>
-      </w:r>
-      <w:r>
-        <w:t xml:space="preserve">obligation and calling the question closed; and counting the unread as done.</w:t>
+        <w:t xml:space="preserve">practice applies. At least five shapes of the same failure are named across the set, and each</w:t>
+      </w:r>
+      <w:r>
+        <w:t xml:space="preserve"> </w:t>
+      </w:r>
+      <w:r>
+        <w:t xml:space="preserve">produces a document that survives accuracy review while describing a practice that does not exist:</w:t>
+      </w:r>
+      <w:r>
+        <w:t xml:space="preserve"> </w:t>
+      </w:r>
+      <w:r>
+        <w:t xml:space="preserve">redefining the pass bar so "it can be configured" counts; widening a soft grade until it absorbs</w:t>
+      </w:r>
+      <w:r>
+        <w:t xml:space="preserve"> </w:t>
+      </w:r>
+      <w:r>
+        <w:t xml:space="preserve">everything ambiguous; writing scope as exclusions that grow to swallow inconvenient cases;</w:t>
+      </w:r>
+      <w:r>
+        <w:t xml:space="preserve"> </w:t>
+      </w:r>
+      <w:r>
+        <w:t xml:space="preserve">transferring an obligation and calling the question closed; and counting the unread as done.</w:t>
       </w:r>
     </w:p>
     <w:p>
@@ -3120,9 +3316,9 @@
         </w:pict>
       </w:r>
     </w:p>
-    <w:bookmarkEnd w:id="24"/>
-    <w:bookmarkEnd w:id="25"/>
-    <w:bookmarkStart w:id="29" w:name="step-3-prioritize-iteratively"/>
+    <w:bookmarkEnd w:id="27"/>
+    <w:bookmarkEnd w:id="28"/>
+    <w:bookmarkStart w:id="32" w:name="step-3-prioritize-iteratively"/>
     <w:p>
       <w:pPr>
         <w:pStyle w:val="Heading2"/>
@@ -3222,7 +3418,7 @@
       <w:r>
         <w:t xml:space="preserve">so instrumentation comes before ranking (</w:t>
       </w:r>
-      <w:hyperlink r:id="rId26">
+      <w:hyperlink r:id="rId29">
         <w:r>
           <w:rPr>
             <w:rStyle w:val="Hyperlink"/>
@@ -3295,7 +3491,7 @@
       <w:r>
         <w:t xml:space="preserve"> </w:t>
       </w:r>
-      <w:hyperlink r:id="rId18">
+      <w:hyperlink r:id="rId19">
         <w:r>
           <w:rPr>
             <w:rStyle w:val="Hyperlink"/>
@@ -3316,7 +3512,7 @@
         <w:t xml:space="preserve">resolve against it.</w:t>
       </w:r>
     </w:p>
-    <w:bookmarkStart w:id="28" w:name="the-build-order"/>
+    <w:bookmarkStart w:id="31" w:name="the-build-order"/>
     <w:p>
       <w:pPr>
         <w:pStyle w:val="Heading3"/>
@@ -3877,7 +4073,7 @@
             <w:pPr>
               <w:pStyle w:val="Compact"/>
             </w:pPr>
-            <w:hyperlink r:id="rId27">
+            <w:hyperlink r:id="rId30">
               <w:r>
                 <w:rPr>
                   <w:rStyle w:val="Hyperlink"/>
@@ -3904,7 +4100,7 @@
             <w:r>
               <w:t xml:space="preserve"> </w:t>
             </w:r>
-            <w:hyperlink r:id="rId21">
+            <w:hyperlink r:id="rId22">
               <w:r>
                 <w:rPr>
                   <w:rStyle w:val="Hyperlink"/>
@@ -3969,7 +4165,7 @@
       <w:r>
         <w:t xml:space="preserve"> </w:t>
       </w:r>
-      <w:hyperlink r:id="rId21">
+      <w:hyperlink r:id="rId22">
         <w:r>
           <w:rPr>
             <w:rStyle w:val="Hyperlink"/>
@@ -4199,9 +4395,9 @@
         </w:pict>
       </w:r>
     </w:p>
-    <w:bookmarkEnd w:id="28"/>
-    <w:bookmarkEnd w:id="29"/>
-    <w:bookmarkStart w:id="34" w:name="X390f9ae4a7fa0d1faf3a62d9fece86e5762888f"/>
+    <w:bookmarkEnd w:id="31"/>
+    <w:bookmarkEnd w:id="32"/>
+    <w:bookmarkStart w:id="35" w:name="X390f9ae4a7fa0d1faf3a62d9fece86e5762888f"/>
     <w:p>
       <w:pPr>
         <w:pStyle w:val="Heading2"/>
@@ -4401,7 +4597,7 @@
         <w:t xml:space="preserve">).</w:t>
       </w:r>
     </w:p>
-    <w:bookmarkStart w:id="31" w:name="what-a-gate-has-to-do-to-count"/>
+    <w:bookmarkStart w:id="33" w:name="what-a-gate-has-to-do-to-count"/>
     <w:p>
       <w:pPr>
         <w:pStyle w:val="Heading3"/>
@@ -4696,7 +4892,7 @@
       <w:r>
         <w:t xml:space="preserve"> </w:t>
       </w:r>
-      <w:hyperlink r:id="rId21">
+      <w:hyperlink r:id="rId22">
         <w:r>
           <w:rPr>
             <w:rStyle w:val="Hyperlink"/>
@@ -4768,7 +4964,7 @@
       <w:r>
         <w:t xml:space="preserve"> </w:t>
       </w:r>
-      <w:hyperlink r:id="rId30">
+      <w:hyperlink r:id="rId23">
         <w:r>
           <w:rPr>
             <w:rStyle w:val="Hyperlink"/>
@@ -4792,8 +4988,8 @@
         <w:t xml:space="preserve">; read them there.</w:t>
       </w:r>
     </w:p>
-    <w:bookmarkEnd w:id="31"/>
-    <w:bookmarkStart w:id="33" w:name="Xd2fe0cdeb6ba2ec693ed00a138bb7be868cd4b6"/>
+    <w:bookmarkEnd w:id="33"/>
+    <w:bookmarkStart w:id="34" w:name="Xd2fe0cdeb6ba2ec693ed00a138bb7be868cd4b6"/>
     <w:p>
       <w:pPr>
         <w:pStyle w:val="Heading3"/>
@@ -4807,13 +5003,13 @@
         <w:pStyle w:val="FirstParagraph"/>
       </w:pPr>
       <w:r>
-        <w:t xml:space="preserve">Say these out loud in your own record, because a green control plane otherwise implies coverage it</w:t>
-      </w:r>
-      <w:r>
-        <w:t xml:space="preserve"> </w:t>
-      </w:r>
-      <w:r>
-        <w:t xml:space="preserve">does not have.</w:t>
+        <w:t xml:space="preserve">At least these, and your setting will add more. Say them out loud in your own record, because a</w:t>
+      </w:r>
+      <w:r>
+        <w:t xml:space="preserve"> </w:t>
+      </w:r>
+      <w:r>
+        <w:t xml:space="preserve">green control plane otherwise implies coverage it does not have.</w:t>
       </w:r>
     </w:p>
     <w:p>
@@ -4884,7 +5080,7 @@
       <w:r>
         <w:t xml:space="preserve"> </w:t>
       </w:r>
-      <w:hyperlink r:id="rId32">
+      <w:hyperlink r:id="rId25">
         <w:r>
           <w:rPr>
             <w:rStyle w:val="Hyperlink"/>
@@ -5064,9 +5260,9 @@
         </w:pict>
       </w:r>
     </w:p>
-    <w:bookmarkEnd w:id="33"/>
     <w:bookmarkEnd w:id="34"/>
-    <w:bookmarkStart w:id="37" w:name="X8f8ce78d1275d6b64745e844e9b4e0b80eddb9e"/>
+    <w:bookmarkEnd w:id="35"/>
+    <w:bookmarkStart w:id="38" w:name="X8f8ce78d1275d6b64745e844e9b4e0b80eddb9e"/>
     <w:p>
       <w:pPr>
         <w:pStyle w:val="Heading2"/>
@@ -5122,7 +5318,7 @@
       <w:r>
         <w:t xml:space="preserve">(</w:t>
       </w:r>
-      <w:hyperlink r:id="rId35">
+      <w:hyperlink r:id="rId36">
         <w:r>
           <w:rPr>
             <w:rStyle w:val="Hyperlink"/>
@@ -5160,25 +5356,6 @@
       <w:r>
         <w:t xml:space="preserve">).</w:t>
       </w:r>
-      <w:r>
-        <w:t xml:space="preserve"> </w:t>
-      </w:r>
-      <w:r>
-        <w:rPr>
-          <w:b/>
-          <w:bCs/>
-        </w:rPr>
-        <w:t xml:space="preserve">It is not a closing section either</w:t>
-      </w:r>
-      <w:r>
-        <w:t xml:space="preserve">, because a closing section reads as a summary,</w:t>
-      </w:r>
-      <w:r>
-        <w:t xml:space="preserve"> </w:t>
-      </w:r>
-      <w:r>
-        <w:t xml:space="preserve">and this is where the other four artifacts stop being documents.</w:t>
-      </w:r>
     </w:p>
     <w:p>
       <w:pPr>
@@ -5218,7 +5395,7 @@
       <w:r>
         <w:t xml:space="preserve"> </w:t>
       </w:r>
-      <w:hyperlink r:id="rId36">
+      <w:hyperlink r:id="rId37">
         <w:r>
           <w:rPr>
             <w:rStyle w:val="Hyperlink"/>
@@ -5260,48 +5437,30 @@
         <w:pStyle w:val="BodyText"/>
       </w:pPr>
       <w:r>
-        <w:t xml:space="preserve">This is also what separates the page from generic adoption advice, which ends at a roadmap or a</w:t>
-      </w:r>
-      <w:r>
-        <w:t xml:space="preserve"> </w:t>
-      </w:r>
-      <w:r>
-        <w:t xml:space="preserve">maturity level. Standing rules here are loaded by the assistant at the start of every session, so a</w:t>
-      </w:r>
-      <w:r>
-        <w:t xml:space="preserve"> </w:t>
-      </w:r>
-      <w:r>
-        <w:t xml:space="preserve">rule that is not in that file is not in force for the actor writing most of the code.</w:t>
-      </w:r>
-      <w:r>
-        <w:t xml:space="preserve"> </w:t>
-      </w:r>
-      <w:hyperlink r:id="rId18">
+        <w:t xml:space="preserve">Standing rules here are loaded by the assistant at the start of every session, so a rule that is not</w:t>
+      </w:r>
+      <w:r>
+        <w:t xml:space="preserve"> </w:t>
+      </w:r>
+      <w:r>
+        <w:t xml:space="preserve">in that file is not in force for the actor writing most of the code.</w:t>
+      </w:r>
+      <w:r>
+        <w:t xml:space="preserve"> </w:t>
+      </w:r>
+      <w:hyperlink r:id="rId19">
         <w:r>
           <w:rPr>
             <w:rStyle w:val="Hyperlink"/>
           </w:rPr>
-          <w:t xml:space="preserve">The</w:t>
-        </w:r>
-        <w:r>
-          <w:rPr>
-            <w:rStyle w:val="Hyperlink"/>
-          </w:rPr>
-          <w:t xml:space="preserve"> </w:t>
-        </w:r>
-        <w:r>
-          <w:rPr>
-            <w:rStyle w:val="Hyperlink"/>
-          </w:rPr>
-          <w:t xml:space="preserve">overview</w:t>
+          <w:t xml:space="preserve">The overview</w:t>
         </w:r>
       </w:hyperlink>
       <w:r>
         <w:t xml:space="preserve"> </w:t>
       </w:r>
       <w:r>
-        <w:t xml:space="preserve">states the consequence as an aside; this page states it as a finish line:</w:t>
+        <w:t xml:space="preserve">states the consequence:</w:t>
       </w:r>
       <w:r>
         <w:t xml:space="preserve"> </w:t>
@@ -5329,18 +5488,18 @@
         <w:t xml:space="preserve"> </w:t>
       </w:r>
       <w:r>
-        <w:t xml:space="preserve">Those five are a strict subset of</w:t>
-      </w:r>
-      <w:r>
-        <w:t xml:space="preserve"> </w:t>
-      </w:r>
-      <w:r>
-        <w:t xml:space="preserve">the six Tier 1 rows in</w:t>
-      </w:r>
-      <w:r>
-        <w:t xml:space="preserve"> </w:t>
-      </w:r>
-      <w:hyperlink r:id="rId21">
+        <w:t xml:space="preserve">Four of those five are Tier 1 rows</w:t>
+      </w:r>
+      <w:r>
+        <w:t xml:space="preserve"> </w:t>
+      </w:r>
+      <w:r>
+        <w:t xml:space="preserve">from</w:t>
+      </w:r>
+      <w:r>
+        <w:t xml:space="preserve"> </w:t>
+      </w:r>
+      <w:hyperlink r:id="rId22">
         <w:r>
           <w:rPr>
             <w:rStyle w:val="Hyperlink"/>
@@ -5359,13 +5518,48 @@
           <w:i/>
           <w:iCs/>
         </w:rPr>
-        <w:t xml:space="preserve">"Tier 1 -- durable controls, which carry the</w:t>
+        <w:t xml:space="preserve">"Tier 1 -- durable controls, which carry the verdict"</w:t>
+      </w:r>
+      <w:r>
+        <w:t xml:space="preserve"> </w:t>
+      </w:r>
+      <w:r>
+        <w:t xml:space="preserve">(architecture, types, dependencies, published artifact); the fifth, the secret scan, comes from</w:t>
+      </w:r>
+      <w:r>
+        <w:t xml:space="preserve"> </w:t>
+      </w:r>
+      <w:hyperlink r:id="rId12">
+        <w:r>
+          <w:rPr>
+            <w:rStyle w:val="Hyperlink"/>
+          </w:rPr>
+          <w:t xml:space="preserve">Secure development</w:t>
+        </w:r>
+      </w:hyperlink>
+      <w:r>
+        <w:t xml:space="preserve">,</w:t>
+      </w:r>
+      <w:r>
+        <w:t xml:space="preserve"> </w:t>
       </w:r>
       <w:r>
         <w:rPr>
           <w:i/>
           <w:iCs/>
         </w:rPr>
+        <w:t xml:space="preserve">"Secrets and repository hygiene"</w:t>
+      </w:r>
+      <w:r>
+        <w:t xml:space="preserve">. So copying the</w:t>
+      </w:r>
+      <w:r>
+        <w:t xml:space="preserve"> </w:t>
+      </w:r>
+      <w:r>
+        <w:t xml:space="preserve">template verbatim leaves two of the six verdict-carrying Tier 1 rows out of your table altogether:</w:t>
+      </w:r>
+      <w:r>
         <w:t xml:space="preserve"> </w:t>
       </w:r>
       <w:r>
@@ -5373,10 +5567,10 @@
           <w:i/>
           <w:iCs/>
         </w:rPr>
-        <w:t xml:space="preserve">verdict"</w:t>
-      </w:r>
-      <w:r>
-        <w:t xml:space="preserve">: copy the template verbatim and you inherit a baseline missing</w:t>
+        <w:t xml:space="preserve">tests verify behavior</w:t>
+      </w:r>
+      <w:r>
+        <w:t xml:space="preserve">, and</w:t>
       </w:r>
       <w:r>
         <w:t xml:space="preserve"> </w:t>
@@ -5386,19 +5580,42 @@
           <w:i/>
           <w:iCs/>
         </w:rPr>
-        <w:t xml:space="preserve">tests verify behavior</w:t>
-      </w:r>
-      <w:r>
-        <w:t xml:space="preserve"> </w:t>
-      </w:r>
-      <w:r>
-        <w:t xml:space="preserve">and</w:t>
-      </w:r>
-      <w:r>
-        <w:t xml:space="preserve"> </w:t>
-      </w:r>
-      <w:r>
-        <w:t xml:space="preserve">the threat-model half of</w:t>
+        <w:t xml:space="preserve">security scanning plus a threat model</w:t>
+      </w:r>
+      <w:r>
+        <w:t xml:space="preserve"> </w:t>
+      </w:r>
+      <w:r>
+        <w:t xml:space="preserve">in all three of its parts --</w:t>
+      </w:r>
+      <w:r>
+        <w:t xml:space="preserve"> </w:t>
+      </w:r>
+      <w:r>
+        <w:t xml:space="preserve">blocking scanners, a written threat model, and a human review step. The secret scan does not stand</w:t>
+      </w:r>
+      <w:r>
+        <w:t xml:space="preserve"> </w:t>
+      </w:r>
+      <w:r>
+        <w:t xml:space="preserve">in for the scanner part: secret scanning is one of three checks in the unwaivable blocking set, not</w:t>
+      </w:r>
+      <w:r>
+        <w:t xml:space="preserve"> </w:t>
+      </w:r>
+      <w:r>
+        <w:t xml:space="preserve">the whole of it (</w:t>
+      </w:r>
+      <w:hyperlink r:id="rId12">
+        <w:r>
+          <w:rPr>
+            <w:rStyle w:val="Hyperlink"/>
+          </w:rPr>
+          <w:t xml:space="preserve">Secure development</w:t>
+        </w:r>
+      </w:hyperlink>
+      <w:r>
+        <w:t xml:space="preserve">,</w:t>
       </w:r>
       <w:r>
         <w:t xml:space="preserve"> </w:t>
@@ -5408,16 +5625,24 @@
           <w:i/>
           <w:iCs/>
         </w:rPr>
-        <w:t xml:space="preserve">security scanning plus a threat model</w:t>
-      </w:r>
-      <w:r>
-        <w:t xml:space="preserve">, from the tier that carries the</w:t>
-      </w:r>
-      <w:r>
-        <w:t xml:space="preserve"> </w:t>
-      </w:r>
-      <w:r>
-        <w:t xml:space="preserve">verdict. Not-built rows point at their register entry. What could not be automated appears as a</w:t>
+        <w:t xml:space="preserve">"What must block, and may not be</w:t>
+      </w:r>
+      <w:r>
+        <w:rPr>
+          <w:i/>
+          <w:iCs/>
+        </w:rPr>
+        <w:t xml:space="preserve"> </w:t>
+      </w:r>
+      <w:r>
+        <w:rPr>
+          <w:i/>
+          <w:iCs/>
+        </w:rPr>
+        <w:t xml:space="preserve">waived"</w:t>
+      </w:r>
+      <w:r>
+        <w:t xml:space="preserve">). Not-built rows point at their register entry. What could not be automated appears as a</w:t>
       </w:r>
       <w:r>
         <w:t xml:space="preserve"> </w:t>
@@ -5485,8 +5710,8 @@
         </w:pict>
       </w:r>
     </w:p>
-    <w:bookmarkEnd w:id="37"/>
-    <w:bookmarkStart w:id="43" w:name="X34b4a2073f4d289cd88cde6649302afaddd1548"/>
+    <w:bookmarkEnd w:id="38"/>
+    <w:bookmarkStart w:id="44" w:name="X34b4a2073f4d289cd88cde6649302afaddd1548"/>
     <w:p>
       <w:pPr>
         <w:pStyle w:val="Heading2"/>
@@ -5528,7 +5753,7 @@
       <w:r>
         <w:t xml:space="preserve"> </w:t>
       </w:r>
-      <w:hyperlink r:id="rId18">
+      <w:hyperlink r:id="rId19">
         <w:r>
           <w:rPr>
             <w:rStyle w:val="Hyperlink"/>
@@ -5558,22 +5783,16 @@
         <w:t xml:space="preserve"> </w:t>
       </w:r>
       <w:r>
-        <w:t xml:space="preserve">be adopted close to whole, so it demonstrates this page's central claim -- you start from partial,</w:t>
-      </w:r>
-      <w:r>
-        <w:t xml:space="preserve"> </w:t>
-      </w:r>
-      <w:r>
-        <w:t xml:space="preserve">not from zero -- rather than asserting it, and because it holds both the cleanest Partial in the set</w:t>
-      </w:r>
-      <w:r>
-        <w:t xml:space="preserve"> </w:t>
-      </w:r>
-      <w:r>
-        <w:t xml:space="preserve">and a control that can never be automated.</w:t>
+        <w:t xml:space="preserve">be adopted close to whole, and because it holds both a clear Partial and a control that can never be</w:t>
+      </w:r>
+      <w:r>
+        <w:t xml:space="preserve"> </w:t>
+      </w:r>
+      <w:r>
+        <w:t xml:space="preserve">automated.</w:t>
       </w:r>
     </w:p>
-    <w:bookmarkStart w:id="38" w:name="step-1----the-baseline"/>
+    <w:bookmarkStart w:id="39" w:name="step-1----the-baseline"/>
     <w:p>
       <w:pPr>
         <w:pStyle w:val="Heading3"/>
@@ -5942,8 +6161,8 @@
         <w:t xml:space="preserve">last row stays unverified, which is not a pass.</w:t>
       </w:r>
     </w:p>
-    <w:bookmarkEnd w:id="38"/>
-    <w:bookmarkStart w:id="39" w:name="step-2----tailor"/>
+    <w:bookmarkEnd w:id="39"/>
+    <w:bookmarkStart w:id="40" w:name="step-2----tailor"/>
     <w:p>
       <w:pPr>
         <w:pStyle w:val="Heading3"/>
@@ -6133,8 +6352,8 @@
         <w:t xml:space="preserve">list is a deviation and needs all four fields.</w:t>
       </w:r>
     </w:p>
-    <w:bookmarkEnd w:id="39"/>
-    <w:bookmarkStart w:id="40" w:name="step-3----prioritize"/>
+    <w:bookmarkEnd w:id="40"/>
+    <w:bookmarkStart w:id="41" w:name="step-3----prioritize"/>
     <w:p>
       <w:pPr>
         <w:pStyle w:val="Heading3"/>
@@ -6251,8 +6470,8 @@
         <w:t xml:space="preserve">things here -- which manifest to fix first, and whether the lock work happens this week or next.</w:t>
       </w:r>
     </w:p>
-    <w:bookmarkEnd w:id="40"/>
-    <w:bookmarkStart w:id="41" w:name="step-4----automate"/>
+    <w:bookmarkEnd w:id="41"/>
+    <w:bookmarkStart w:id="42" w:name="step-4----automate"/>
     <w:p>
       <w:pPr>
         <w:pStyle w:val="Heading3"/>
@@ -6552,8 +6771,8 @@
         <w:t xml:space="preserve">in the project instruction file.</w:t>
       </w:r>
     </w:p>
-    <w:bookmarkEnd w:id="41"/>
-    <w:bookmarkStart w:id="42" w:name="step-5----wire-it-in"/>
+    <w:bookmarkEnd w:id="42"/>
+    <w:bookmarkStart w:id="43" w:name="step-5----wire-it-in"/>
     <w:p>
       <w:pPr>
         <w:pStyle w:val="Heading3"/>
@@ -6808,8 +7027,8 @@
         </w:pict>
       </w:r>
     </w:p>
-    <w:bookmarkEnd w:id="42"/>
     <w:bookmarkEnd w:id="43"/>
+    <w:bookmarkEnd w:id="44"/>
     <w:bookmarkStart w:id="52" w:name="the-worksheet"/>
     <w:p>
       <w:pPr>
@@ -6845,7 +7064,7 @@
         <w:t xml:space="preserve">set, and your own setting will add rows.</w:t>
       </w:r>
     </w:p>
-    <w:bookmarkStart w:id="44" w:name="how-to-read-the-columns"/>
+    <w:bookmarkStart w:id="45" w:name="how-to-read-the-columns"/>
     <w:p>
       <w:pPr>
         <w:pStyle w:val="Heading3"/>
@@ -7202,8 +7421,8 @@
         </w:tc>
       </w:tr>
     </w:tbl>
-    <w:bookmarkEnd w:id="44"/>
-    <w:bookmarkStart w:id="45" w:name="ai-assisted-development"/>
+    <w:bookmarkEnd w:id="45"/>
+    <w:bookmarkStart w:id="46" w:name="ai-assisted-development"/>
     <w:p>
       <w:pPr>
         <w:pStyle w:val="Heading3"/>
@@ -8933,8 +9152,8 @@
         </w:tc>
       </w:tr>
     </w:tbl>
-    <w:bookmarkEnd w:id="45"/>
-    <w:bookmarkStart w:id="46" w:name="human-review-of-code"/>
+    <w:bookmarkEnd w:id="46"/>
+    <w:bookmarkStart w:id="47" w:name="human-review-of-code"/>
     <w:p>
       <w:pPr>
         <w:pStyle w:val="Heading3"/>
@@ -8953,7 +9172,7 @@
       <w:r>
         <w:t xml:space="preserve"> </w:t>
       </w:r>
-      <w:hyperlink r:id="rId32">
+      <w:hyperlink r:id="rId25">
         <w:r>
           <w:rPr>
             <w:rStyle w:val="Hyperlink"/>
@@ -9405,8 +9624,8 @@
         </w:tc>
       </w:tr>
     </w:tbl>
-    <w:bookmarkEnd w:id="46"/>
-    <w:bookmarkStart w:id="47" w:name="code-quality"/>
+    <w:bookmarkEnd w:id="47"/>
+    <w:bookmarkStart w:id="48" w:name="code-quality"/>
     <w:p>
       <w:pPr>
         <w:pStyle w:val="Heading3"/>
@@ -9425,7 +9644,7 @@
       <w:r>
         <w:t xml:space="preserve"> </w:t>
       </w:r>
-      <w:hyperlink r:id="rId21">
+      <w:hyperlink r:id="rId22">
         <w:r>
           <w:rPr>
             <w:rStyle w:val="Hyperlink"/>
@@ -11136,8 +11355,8 @@
         </w:tc>
       </w:tr>
     </w:tbl>
-    <w:bookmarkEnd w:id="47"/>
-    <w:bookmarkStart w:id="48" w:name="dependency-integrity"/>
+    <w:bookmarkEnd w:id="48"/>
+    <w:bookmarkStart w:id="49" w:name="dependency-integrity"/>
     <w:p>
       <w:pPr>
         <w:pStyle w:val="Heading3"/>
@@ -12712,8 +12931,8 @@
         </w:tc>
       </w:tr>
     </w:tbl>
-    <w:bookmarkEnd w:id="48"/>
-    <w:bookmarkStart w:id="49" w:name="secure-development"/>
+    <w:bookmarkEnd w:id="49"/>
+    <w:bookmarkStart w:id="50" w:name="secure-development"/>
     <w:p>
       <w:pPr>
         <w:pStyle w:val="Heading3"/>
@@ -15331,7 +15550,7 @@
         </w:tc>
       </w:tr>
     </w:tbl>
-    <w:bookmarkEnd w:id="49"/>
+    <w:bookmarkEnd w:id="50"/>
     <w:bookmarkStart w:id="51" w:name="Xba6ba77899183ce46186f7e21435e31b80a74c1"/>
     <w:p>
       <w:pPr>
@@ -15351,7 +15570,7 @@
       <w:r>
         <w:t xml:space="preserve"> </w:t>
       </w:r>
-      <w:hyperlink r:id="rId50">
+      <w:hyperlink r:id="rId16">
         <w:r>
           <w:rPr>
             <w:rStyle w:val="Hyperlink"/>
@@ -16693,7 +16912,7 @@
             <w:pPr>
               <w:pStyle w:val="Compact"/>
             </w:pPr>
-            <w:hyperlink r:id="rId18">
+            <w:hyperlink r:id="rId19">
               <w:r>
                 <w:rPr>
                   <w:rStyle w:val="Hyperlink"/>
@@ -16722,7 +16941,7 @@
             <w:pPr>
               <w:pStyle w:val="Compact"/>
             </w:pPr>
-            <w:hyperlink r:id="rId27">
+            <w:hyperlink r:id="rId30">
               <w:r>
                 <w:rPr>
                   <w:rStyle w:val="Hyperlink"/>
@@ -16751,7 +16970,7 @@
             <w:pPr>
               <w:pStyle w:val="Compact"/>
             </w:pPr>
-            <w:hyperlink r:id="rId36">
+            <w:hyperlink r:id="rId37">
               <w:r>
                 <w:rPr>
                   <w:rStyle w:val="Hyperlink"/>
@@ -16862,7 +17081,7 @@
             <w:pPr>
               <w:pStyle w:val="Compact"/>
             </w:pPr>
-            <w:hyperlink r:id="rId30">
+            <w:hyperlink r:id="rId23">
               <w:r>
                 <w:rPr>
                   <w:rStyle w:val="Hyperlink"/>
@@ -16891,7 +17110,7 @@
             <w:pPr>
               <w:pStyle w:val="Compact"/>
             </w:pPr>
-            <w:hyperlink r:id="rId26">
+            <w:hyperlink r:id="rId29">
               <w:r>
                 <w:rPr>
                   <w:rStyle w:val="Hyperlink"/>

</xml_diff>

<commit_message>
docs(standards): the adoption page's BLUF heading missed the rename in flight
37102f2 pinned the spelling as TLDR/BLUF and 38b73a1 converted the pages that
existed at the time. This page's BLUF was written against the older "In short"
convention in a parallel worktree and merged after both, so it arrived as the
twelfth page and the only one still on the old spelling -- the same in-flight
rename miss that 2d1f0e6 caught three of.

The pinning test is what surfaced it, on the first run after the merge.

Word copy regenerated with pandoc 3.10. 109 tests, ASCII exit 0.

Co-Authored-By: Claude Opus 5 <noreply@anthropic.com>
</commit_message>
<xml_diff>
--- a/docs/standards/word/ADOPTING-THESE.docx
+++ b/docs/standards/word/ADOPTING-THESE.docx
@@ -113,13 +113,13 @@
         </w:pict>
       </w:r>
     </w:p>
-    <w:bookmarkStart w:id="12" w:name="in-short"/>
+    <w:bookmarkStart w:id="12" w:name="tldrbluf"/>
     <w:p>
       <w:pPr>
         <w:pStyle w:val="Heading2"/>
       </w:pPr>
       <w:r>
-        <w:t xml:space="preserve">In short</w:t>
+        <w:t xml:space="preserve">TLDR/BLUF</w:t>
       </w:r>
     </w:p>
     <w:p>

</xml_diff>